<commit_message>
Update Data in Portfolio
</commit_message>
<xml_diff>
--- a/src/assets/AmritPalSingh_Resume_v2.docx
+++ b/src/assets/AmritPalSingh_Resume_v2.docx
@@ -1,6 +1,6 @@
 
 <file path=word/document.xml><?xml version="1.0" encoding="utf-8"?>
-<w:document xmlns:wpc="http://schemas.microsoft.com/office/word/2010/wordprocessingCanvas" xmlns:cx="http://schemas.microsoft.com/office/drawing/2014/chartex" xmlns:cx1="http://schemas.microsoft.com/office/drawing/2015/9/8/chartex" xmlns:cx2="http://schemas.microsoft.com/office/drawing/2015/10/21/chartex" xmlns:cx3="http://schemas.microsoft.com/office/drawing/2016/5/9/chartex" xmlns:cx4="http://schemas.microsoft.com/office/drawing/2016/5/10/chartex" xmlns:cx5="http://schemas.microsoft.com/office/drawing/2016/5/11/chartex" xmlns:cx6="http://schemas.microsoft.com/office/drawing/2016/5/12/chartex" xmlns:cx7="http://schemas.microsoft.com/office/drawing/2016/5/13/chartex" xmlns:cx8="http://schemas.microsoft.com/office/drawing/2016/5/14/chartex" xmlns:mc="http://schemas.openxmlformats.org/markup-compatibility/2006" xmlns:aink="http://schemas.microsoft.com/office/drawing/2016/ink" xmlns:am3d="http://schemas.microsoft.com/office/drawing/2017/model3d" xmlns:o="urn:schemas-microsoft-com:office:office" xmlns:oel="http://schemas.microsoft.com/office/2019/extlst" xmlns:r="http://schemas.openxmlformats.org/officeDocument/2006/relationships" xmlns:m="http://schemas.openxmlformats.org/officeDocument/2006/math" xmlns:v="urn:schemas-microsoft-com:vml" xmlns:wp14="http://schemas.microsoft.com/office/word/2010/wordprocessingDrawing" xmlns:wp="http://schemas.openxmlformats.org/drawingml/2006/wordprocessingDrawing" xmlns:w10="urn:schemas-microsoft-com:office:word" xmlns:w="http://schemas.openxmlformats.org/wordprocessingml/2006/main" xmlns:w14="http://schemas.microsoft.com/office/word/2010/wordml" xmlns:w15="http://schemas.microsoft.com/office/word/2012/wordml" xmlns:w16cei="http://schemas.microsoft.com/office/word/2026/wordml/cei" xmlns:w16cex="http://schemas.microsoft.com/office/word/2018/wordml/cex" xmlns:w16cid="http://schemas.microsoft.com/office/word/2016/wordml/cid" xmlns:w16="http://schemas.microsoft.com/office/word/2018/wordml" xmlns:w16du="http://schemas.microsoft.com/office/word/2023/wordml/word16du" xmlns:w16sdtdh="http://schemas.microsoft.com/office/word/2020/wordml/sdtdatahash" xmlns:w16sdtfl="http://schemas.microsoft.com/office/word/2024/wordml/sdtformatlock" xmlns:w16se="http://schemas.microsoft.com/office/word/2015/wordml/symex" xmlns:wpg="http://schemas.microsoft.com/office/word/2010/wordprocessingGroup" xmlns:wpi="http://schemas.microsoft.com/office/word/2010/wordprocessingInk" xmlns:wne="http://schemas.microsoft.com/office/word/2006/wordml" xmlns:wps="http://schemas.microsoft.com/office/word/2010/wordprocessingShape" mc:Ignorable="w14 w15 w16se w16cid w16 w16cex w16sdtdh w16sdtfl w16du wp14">
+<w:document xmlns:wpc="http://schemas.microsoft.com/office/word/2010/wordprocessingCanvas" xmlns:cx="http://schemas.microsoft.com/office/drawing/2014/chartex" xmlns:cx1="http://schemas.microsoft.com/office/drawing/2015/9/8/chartex" xmlns:cx2="http://schemas.microsoft.com/office/drawing/2015/10/21/chartex" xmlns:cx3="http://schemas.microsoft.com/office/drawing/2016/5/9/chartex" xmlns:cx4="http://schemas.microsoft.com/office/drawing/2016/5/10/chartex" xmlns:cx5="http://schemas.microsoft.com/office/drawing/2016/5/11/chartex" xmlns:cx6="http://schemas.microsoft.com/office/drawing/2016/5/12/chartex" xmlns:cx7="http://schemas.microsoft.com/office/drawing/2016/5/13/chartex" xmlns:cx8="http://schemas.microsoft.com/office/drawing/2016/5/14/chartex" xmlns:mc="http://schemas.openxmlformats.org/markup-compatibility/2006" xmlns:aink="http://schemas.microsoft.com/office/drawing/2016/ink" xmlns:am3d="http://schemas.microsoft.com/office/drawing/2017/model3d" xmlns:o="urn:schemas-microsoft-com:office:office" xmlns:oel="http://schemas.microsoft.com/office/2019/extlst" xmlns:r="http://schemas.openxmlformats.org/officeDocument/2006/relationships" xmlns:m="http://schemas.openxmlformats.org/officeDocument/2006/math" xmlns:v="urn:schemas-microsoft-com:vml" xmlns:wp14="http://schemas.microsoft.com/office/word/2010/wordprocessingDrawing" xmlns:wp="http://schemas.openxmlformats.org/drawingml/2006/wordprocessingDrawing" xmlns:w10="urn:schemas-microsoft-com:office:word" xmlns:w="http://schemas.openxmlformats.org/wordprocessingml/2006/main" xmlns:w14="http://schemas.microsoft.com/office/word/2010/wordml" xmlns:w15="http://schemas.microsoft.com/office/word/2012/wordml" xmlns:w16cex="http://schemas.microsoft.com/office/word/2018/wordml/cex" xmlns:w16cid="http://schemas.microsoft.com/office/word/2016/wordml/cid" xmlns:w16="http://schemas.microsoft.com/office/word/2018/wordml" xmlns:w16du="http://schemas.microsoft.com/office/word/2023/wordml/word16du" xmlns:w16sdtdh="http://schemas.microsoft.com/office/word/2020/wordml/sdtdatahash" xmlns:w16sdtfl="http://schemas.microsoft.com/office/word/2024/wordml/sdtformatlock" xmlns:w16se="http://schemas.microsoft.com/office/word/2015/wordml/symex" xmlns:wpg="http://schemas.microsoft.com/office/word/2010/wordprocessingGroup" xmlns:wpi="http://schemas.microsoft.com/office/word/2010/wordprocessingInk" xmlns:wne="http://schemas.microsoft.com/office/word/2006/wordml" xmlns:wps="http://schemas.microsoft.com/office/word/2010/wordprocessingShape" mc:Ignorable="w14 w15 w16se w16cid w16 w16cex w16sdtdh w16sdtfl w16du wp14">
   <w:body>
     <w:p>
       <w:pPr>
@@ -41,7 +41,15 @@
           <w:sz w:val="19"/>
           <w:szCs w:val="19"/>
         </w:rPr>
-        <w:t>+91 86793 93180</w:t>
+        <w:t xml:space="preserve">+91 86793 </w:t>
+      </w:r>
+      <w:proofErr w:type="gramStart"/>
+      <w:r>
+        <w:rPr>
+          <w:sz w:val="19"/>
+          <w:szCs w:val="19"/>
+        </w:rPr>
+        <w:t>93180</w:t>
       </w:r>
       <w:r>
         <w:rPr>
@@ -49,7 +57,16 @@
           <w:sz w:val="19"/>
           <w:szCs w:val="19"/>
         </w:rPr>
-        <w:t xml:space="preserve">  |  </w:t>
+        <w:t xml:space="preserve">  |</w:t>
+      </w:r>
+      <w:proofErr w:type="gramEnd"/>
+      <w:r>
+        <w:rPr>
+          <w:color w:val="555555"/>
+          <w:sz w:val="19"/>
+          <w:szCs w:val="19"/>
+        </w:rPr>
+        <w:t xml:space="preserve">  </w:t>
       </w:r>
       <w:hyperlink r:id="rId5" w:history="1">
         <w:r>
@@ -125,7 +142,15 @@
         <w:spacing w:after="40"/>
       </w:pPr>
       <w:r>
-        <w:t>Full Stack .NET Developer with internship and project experience building and deploying ASP.NET Core Web APIs, Angular applications, and SQL Server-backed systems. Reduced API response times by ~30% and developed production-style SaaS, document-intelligence, and incident-management platforms using C#, EF Core, JWT/RBAC, SignalR, Hangfire, and Azure.</w:t>
+        <w:t xml:space="preserve">Full Stack .NET Developer with internship and project experience building and deploying ASP.NET Core Web APIs, Angular applications, and SQL Server-backed systems. Reduced API response times by ~30% and developed production-style SaaS, document-intelligence, and incident-management platforms using C#, EF Core, JWT/RBAC, </w:t>
+      </w:r>
+      <w:proofErr w:type="spellStart"/>
+      <w:r>
+        <w:t>SignalR</w:t>
+      </w:r>
+      <w:proofErr w:type="spellEnd"/>
+      <w:r>
+        <w:t>, Hangfire, and Azure.</w:t>
       </w:r>
     </w:p>
     <w:p>
@@ -158,11 +183,18 @@
         <w:t xml:space="preserve">Languages: </w:t>
       </w:r>
       <w:r>
-        <w:t>C#, TypeScript, JavaScript, SQL</w:t>
+        <w:t xml:space="preserve">C#, TypeScript, JavaScript, </w:t>
+      </w:r>
+      <w:proofErr w:type="spellStart"/>
+      <w:proofErr w:type="gramStart"/>
+      <w:r>
+        <w:t>SQL</w:t>
       </w:r>
       <w:r>
         <w:t>,Python</w:t>
       </w:r>
+      <w:proofErr w:type="spellEnd"/>
+      <w:proofErr w:type="gramEnd"/>
     </w:p>
     <w:p>
       <w:pPr>
@@ -175,7 +207,15 @@
         <w:t xml:space="preserve">Frontend: </w:t>
       </w:r>
       <w:r>
-        <w:t>Angular, RxJS, Tailwind CSS, HTML5, CSS3, SCSS</w:t>
+        <w:t xml:space="preserve">Angular, </w:t>
+      </w:r>
+      <w:proofErr w:type="spellStart"/>
+      <w:r>
+        <w:t>RxJS</w:t>
+      </w:r>
+      <w:proofErr w:type="spellEnd"/>
+      <w:r>
+        <w:t>, Tailwind CSS, HTML5, CSS3, SCSS</w:t>
       </w:r>
     </w:p>
     <w:p>
@@ -189,11 +229,29 @@
         <w:t xml:space="preserve">Backend: </w:t>
       </w:r>
       <w:r>
-        <w:t>ASP.NET Core, Web API, EF Core, LINQ, ADO.NET, SignalR, Hangfire</w:t>
-      </w:r>
-      <w:r>
-        <w:t>,Flask</w:t>
-      </w:r>
+        <w:t xml:space="preserve">ASP.NET Core, Web API, EF Core, LINQ, ADO.NET, </w:t>
+      </w:r>
+      <w:proofErr w:type="spellStart"/>
+      <w:r>
+        <w:t>SignalR</w:t>
+      </w:r>
+      <w:proofErr w:type="spellEnd"/>
+      <w:r>
+        <w:t xml:space="preserve">, </w:t>
+      </w:r>
+      <w:proofErr w:type="spellStart"/>
+      <w:proofErr w:type="gramStart"/>
+      <w:r>
+        <w:t>Hangfire</w:t>
+      </w:r>
+      <w:r>
+        <w:t>,F</w:t>
+      </w:r>
+      <w:r>
+        <w:t>astapi</w:t>
+      </w:r>
+      <w:proofErr w:type="spellEnd"/>
+      <w:proofErr w:type="gramEnd"/>
     </w:p>
     <w:p>
       <w:pPr>
@@ -203,10 +261,18 @@
         <w:rPr>
           <w:b/>
         </w:rPr>
-        <w:t xml:space="preserve">,Databases, Cloud &amp; Tools: </w:t>
-      </w:r>
-      <w:r>
-        <w:t>SQL Server, PostgreSQL, Azure, Railway, Vercel, Git, GitHub, Postman</w:t>
+        <w:t xml:space="preserve">Databases, Cloud &amp; Tools: </w:t>
+      </w:r>
+      <w:r>
+        <w:t xml:space="preserve">SQL Server, PostgreSQL, Azure, Railway, </w:t>
+      </w:r>
+      <w:proofErr w:type="spellStart"/>
+      <w:r>
+        <w:t>Vercel</w:t>
+      </w:r>
+      <w:proofErr w:type="spellEnd"/>
+      <w:r>
+        <w:t>, Git, GitHub, Postman</w:t>
       </w:r>
     </w:p>
     <w:p>
@@ -251,7 +317,15 @@
           <w:color w:val="555555"/>
         </w:rPr>
         <w:tab/>
-        <w:t>Jan 2026 – Present</w:t>
+        <w:t xml:space="preserve">Jan 2026 – </w:t>
+      </w:r>
+      <w:r>
+        <w:rPr>
+          <w:i/>
+          <w:iCs/>
+          <w:color w:val="555555"/>
+        </w:rPr>
+        <w:t>Sep 2026</w:t>
       </w:r>
     </w:p>
     <w:p>
@@ -307,7 +381,27 @@
           <w:sz w:val="21"/>
           <w:szCs w:val="21"/>
         </w:rPr>
-        <w:t>Backend Developer Intern — Cynoteck Technology Solutions</w:t>
+        <w:t xml:space="preserve">Backend Developer Intern — </w:t>
+      </w:r>
+      <w:proofErr w:type="spellStart"/>
+      <w:r>
+        <w:rPr>
+          <w:b/>
+          <w:bCs/>
+          <w:sz w:val="21"/>
+          <w:szCs w:val="21"/>
+        </w:rPr>
+        <w:t>Cynoteck</w:t>
+      </w:r>
+      <w:proofErr w:type="spellEnd"/>
+      <w:r>
+        <w:rPr>
+          <w:b/>
+          <w:bCs/>
+          <w:sz w:val="21"/>
+          <w:szCs w:val="21"/>
+        </w:rPr>
+        <w:t xml:space="preserve"> Technology Solutions</w:t>
       </w:r>
       <w:r>
         <w:rPr>
@@ -400,7 +494,22 @@
           <w:color w:val="555555"/>
         </w:rPr>
         <w:tab/>
-        <w:t>Jul 2026 – Present</w:t>
+      </w:r>
+      <w:r>
+        <w:rPr>
+          <w:i/>
+          <w:iCs/>
+          <w:color w:val="555555"/>
+        </w:rPr>
+        <w:t xml:space="preserve">Sep </w:t>
+      </w:r>
+      <w:r>
+        <w:rPr>
+          <w:i/>
+          <w:iCs/>
+          <w:color w:val="555555"/>
+        </w:rPr>
+        <w:t>2026 – Present</w:t>
       </w:r>
     </w:p>
     <w:p>
@@ -426,7 +535,15 @@
         <w:spacing w:after="10"/>
       </w:pPr>
       <w:r>
-        <w:t>Translating a mobile Figma design into a responsive Angular SPA using signals, inject(), and standalone components for maintainable frontend architecture.</w:t>
+        <w:t xml:space="preserve">Translating a mobile Figma design into a responsive Angular SPA using signals, </w:t>
+      </w:r>
+      <w:proofErr w:type="gramStart"/>
+      <w:r>
+        <w:t>inject(</w:t>
+      </w:r>
+      <w:proofErr w:type="gramEnd"/>
+      <w:r>
+        <w:t>), and standalone components for maintainable frontend architecture.</w:t>
       </w:r>
     </w:p>
     <w:p>
@@ -436,6 +553,7 @@
         </w:tabs>
         <w:spacing w:before="30"/>
       </w:pPr>
+      <w:proofErr w:type="spellStart"/>
       <w:r>
         <w:rPr>
           <w:b/>
@@ -443,7 +561,17 @@
           <w:sz w:val="21"/>
           <w:szCs w:val="21"/>
         </w:rPr>
-        <w:t xml:space="preserve">HireFlow — Recruitment Pipeline SaaS — </w:t>
+        <w:t>HireFlow</w:t>
+      </w:r>
+      <w:proofErr w:type="spellEnd"/>
+      <w:r>
+        <w:rPr>
+          <w:b/>
+          <w:bCs/>
+          <w:sz w:val="21"/>
+          <w:szCs w:val="21"/>
+        </w:rPr>
+        <w:t xml:space="preserve"> — Recruitment Pipeline SaaS — </w:t>
       </w:r>
       <w:hyperlink r:id="rId8" w:history="1">
         <w:r>
@@ -526,7 +654,15 @@
         <w:spacing w:after="10"/>
       </w:pPr>
       <w:r>
-        <w:t>Deployed the API, database, and frontend across Azure, Railway, and Vercel to demonstrate an end-to-end production-style architecture.</w:t>
+        <w:t xml:space="preserve">Deployed the API, database, and frontend across Azure, Railway, and </w:t>
+      </w:r>
+      <w:proofErr w:type="spellStart"/>
+      <w:r>
+        <w:t>Vercel</w:t>
+      </w:r>
+      <w:proofErr w:type="spellEnd"/>
+      <w:r>
+        <w:t xml:space="preserve"> to demonstrate an end-to-end production-style architecture.</w:t>
       </w:r>
     </w:p>
     <w:p>
@@ -536,6 +672,7 @@
         </w:tabs>
         <w:spacing w:before="30"/>
       </w:pPr>
+      <w:proofErr w:type="spellStart"/>
       <w:r>
         <w:rPr>
           <w:b/>
@@ -543,7 +680,17 @@
           <w:sz w:val="21"/>
           <w:szCs w:val="21"/>
         </w:rPr>
-        <w:t xml:space="preserve">InsightFlow — AI Document Intelligence Platform — </w:t>
+        <w:t>InsightFlow</w:t>
+      </w:r>
+      <w:proofErr w:type="spellEnd"/>
+      <w:r>
+        <w:rPr>
+          <w:b/>
+          <w:bCs/>
+          <w:sz w:val="21"/>
+          <w:szCs w:val="21"/>
+        </w:rPr>
+        <w:t xml:space="preserve"> — AI Document Intelligence Platform — </w:t>
       </w:r>
       <w:hyperlink r:id="rId10" w:history="1">
         <w:r>
@@ -636,6 +783,7 @@
         </w:tabs>
         <w:spacing w:before="30"/>
       </w:pPr>
+      <w:proofErr w:type="spellStart"/>
       <w:r>
         <w:rPr>
           <w:b/>
@@ -643,7 +791,17 @@
           <w:sz w:val="21"/>
           <w:szCs w:val="21"/>
         </w:rPr>
-        <w:t xml:space="preserve">SignalOps — Incident Management Platform — </w:t>
+        <w:t>SignalOps</w:t>
+      </w:r>
+      <w:proofErr w:type="spellEnd"/>
+      <w:r>
+        <w:rPr>
+          <w:b/>
+          <w:bCs/>
+          <w:sz w:val="21"/>
+          <w:szCs w:val="21"/>
+        </w:rPr>
+        <w:t xml:space="preserve"> — Incident Management Platform — </w:t>
       </w:r>
       <w:hyperlink r:id="rId12" w:history="1">
         <w:r>
@@ -713,7 +871,15 @@
         <w:spacing w:after="10"/>
       </w:pPr>
       <w:r>
-        <w:t>Used SignalR for live status updates and Hangfire for scheduled escalation jobs across the incident lifecycle.</w:t>
+        <w:t xml:space="preserve">Used </w:t>
+      </w:r>
+      <w:proofErr w:type="spellStart"/>
+      <w:r>
+        <w:t>SignalR</w:t>
+      </w:r>
+      <w:proofErr w:type="spellEnd"/>
+      <w:r>
+        <w:t xml:space="preserve"> for live status updates and Hangfire for scheduled escalation jobs across the incident lifecycle.</w:t>
       </w:r>
     </w:p>
     <w:p>
@@ -776,8 +942,15 @@
       <w:pPr>
         <w:spacing w:after="40"/>
       </w:pPr>
-      <w:r>
-        <w:t xml:space="preserve">B.Tech in Computer Science and Engineering </w:t>
+      <w:proofErr w:type="spellStart"/>
+      <w:proofErr w:type="gramStart"/>
+      <w:r>
+        <w:t>B.Tech</w:t>
+      </w:r>
+      <w:proofErr w:type="spellEnd"/>
+      <w:proofErr w:type="gramEnd"/>
+      <w:r>
+        <w:t xml:space="preserve"> in Computer Science and Engineering </w:t>
       </w:r>
     </w:p>
     <w:p>
@@ -838,7 +1011,7 @@
 </file>
 
 <file path=word/numbering.xml><?xml version="1.0" encoding="utf-8"?>
-<w:numbering xmlns:wpc="http://schemas.microsoft.com/office/word/2010/wordprocessingCanvas" xmlns:cx="http://schemas.microsoft.com/office/drawing/2014/chartex" xmlns:cx1="http://schemas.microsoft.com/office/drawing/2015/9/8/chartex" xmlns:cx2="http://schemas.microsoft.com/office/drawing/2015/10/21/chartex" xmlns:cx3="http://schemas.microsoft.com/office/drawing/2016/5/9/chartex" xmlns:cx4="http://schemas.microsoft.com/office/drawing/2016/5/10/chartex" xmlns:cx5="http://schemas.microsoft.com/office/drawing/2016/5/11/chartex" xmlns:cx6="http://schemas.microsoft.com/office/drawing/2016/5/12/chartex" xmlns:cx7="http://schemas.microsoft.com/office/drawing/2016/5/13/chartex" xmlns:cx8="http://schemas.microsoft.com/office/drawing/2016/5/14/chartex" xmlns:mc="http://schemas.openxmlformats.org/markup-compatibility/2006" xmlns:aink="http://schemas.microsoft.com/office/drawing/2016/ink" xmlns:am3d="http://schemas.microsoft.com/office/drawing/2017/model3d" xmlns:o="urn:schemas-microsoft-com:office:office" xmlns:oel="http://schemas.microsoft.com/office/2019/extlst" xmlns:r="http://schemas.openxmlformats.org/officeDocument/2006/relationships" xmlns:m="http://schemas.openxmlformats.org/officeDocument/2006/math" xmlns:v="urn:schemas-microsoft-com:vml" xmlns:wp14="http://schemas.microsoft.com/office/word/2010/wordprocessingDrawing" xmlns:wp="http://schemas.openxmlformats.org/drawingml/2006/wordprocessingDrawing" xmlns:w10="urn:schemas-microsoft-com:office:word" xmlns:w="http://schemas.openxmlformats.org/wordprocessingml/2006/main" xmlns:w14="http://schemas.microsoft.com/office/word/2010/wordml" xmlns:w15="http://schemas.microsoft.com/office/word/2012/wordml" xmlns:w16cei="http://schemas.microsoft.com/office/word/2026/wordml/cei" xmlns:w16cex="http://schemas.microsoft.com/office/word/2018/wordml/cex" xmlns:w16cid="http://schemas.microsoft.com/office/word/2016/wordml/cid" xmlns:w16="http://schemas.microsoft.com/office/word/2018/wordml" xmlns:w16du="http://schemas.microsoft.com/office/word/2023/wordml/word16du" xmlns:w16sdtdh="http://schemas.microsoft.com/office/word/2020/wordml/sdtdatahash" xmlns:w16sdtfl="http://schemas.microsoft.com/office/word/2024/wordml/sdtformatlock" xmlns:w16se="http://schemas.microsoft.com/office/word/2015/wordml/symex" xmlns:wpg="http://schemas.microsoft.com/office/word/2010/wordprocessingGroup" xmlns:wpi="http://schemas.microsoft.com/office/word/2010/wordprocessingInk" xmlns:wne="http://schemas.microsoft.com/office/word/2006/wordml" xmlns:wps="http://schemas.microsoft.com/office/word/2010/wordprocessingShape" mc:Ignorable="w14 w15 w16se w16cid w16 w16cex w16sdtdh w16sdtfl w16du wp14">
+<w:numbering xmlns:wpc="http://schemas.microsoft.com/office/word/2010/wordprocessingCanvas" xmlns:cx="http://schemas.microsoft.com/office/drawing/2014/chartex" xmlns:cx1="http://schemas.microsoft.com/office/drawing/2015/9/8/chartex" xmlns:cx2="http://schemas.microsoft.com/office/drawing/2015/10/21/chartex" xmlns:cx3="http://schemas.microsoft.com/office/drawing/2016/5/9/chartex" xmlns:cx4="http://schemas.microsoft.com/office/drawing/2016/5/10/chartex" xmlns:cx5="http://schemas.microsoft.com/office/drawing/2016/5/11/chartex" xmlns:cx6="http://schemas.microsoft.com/office/drawing/2016/5/12/chartex" xmlns:cx7="http://schemas.microsoft.com/office/drawing/2016/5/13/chartex" xmlns:cx8="http://schemas.microsoft.com/office/drawing/2016/5/14/chartex" xmlns:mc="http://schemas.openxmlformats.org/markup-compatibility/2006" xmlns:aink="http://schemas.microsoft.com/office/drawing/2016/ink" xmlns:am3d="http://schemas.microsoft.com/office/drawing/2017/model3d" xmlns:o="urn:schemas-microsoft-com:office:office" xmlns:oel="http://schemas.microsoft.com/office/2019/extlst" xmlns:r="http://schemas.openxmlformats.org/officeDocument/2006/relationships" xmlns:m="http://schemas.openxmlformats.org/officeDocument/2006/math" xmlns:v="urn:schemas-microsoft-com:vml" xmlns:wp14="http://schemas.microsoft.com/office/word/2010/wordprocessingDrawing" xmlns:wp="http://schemas.openxmlformats.org/drawingml/2006/wordprocessingDrawing" xmlns:w10="urn:schemas-microsoft-com:office:word" xmlns:w="http://schemas.openxmlformats.org/wordprocessingml/2006/main" xmlns:w14="http://schemas.microsoft.com/office/word/2010/wordml" xmlns:w15="http://schemas.microsoft.com/office/word/2012/wordml" xmlns:w16cex="http://schemas.microsoft.com/office/word/2018/wordml/cex" xmlns:w16cid="http://schemas.microsoft.com/office/word/2016/wordml/cid" xmlns:w16="http://schemas.microsoft.com/office/word/2018/wordml" xmlns:w16du="http://schemas.microsoft.com/office/word/2023/wordml/word16du" xmlns:w16sdtdh="http://schemas.microsoft.com/office/word/2020/wordml/sdtdatahash" xmlns:w16sdtfl="http://schemas.microsoft.com/office/word/2024/wordml/sdtformatlock" xmlns:w16se="http://schemas.microsoft.com/office/word/2015/wordml/symex" xmlns:wpg="http://schemas.microsoft.com/office/word/2010/wordprocessingGroup" xmlns:wpi="http://schemas.microsoft.com/office/word/2010/wordprocessingInk" xmlns:wne="http://schemas.microsoft.com/office/word/2006/wordml" xmlns:wps="http://schemas.microsoft.com/office/word/2010/wordprocessingShape" mc:Ignorable="w14 w15 w16se w16cid w16 w16cex w16sdtdh w16sdtfl w16du wp14">
   <w:abstractNum w:abstractNumId="0" w15:restartNumberingAfterBreak="0">
     <w:nsid w:val="265418B8"/>
     <w:multiLevelType w:val="hybridMultilevel"/>

</xml_diff>

<commit_message>
Updated Projects and Experience Section
</commit_message>
<xml_diff>
--- a/src/assets/AmritPalSingh_Resume_v2.docx
+++ b/src/assets/AmritPalSingh_Resume_v2.docx
@@ -117,6 +117,14 @@
           <w:t>github.com/gitamrit1443</w:t>
         </w:r>
       </w:hyperlink>
+      <w:r>
+        <w:t xml:space="preserve"> |</w:t>
+      </w:r>
+      <w:proofErr w:type="spellStart"/>
+      <w:r>
+        <w:t>amritpalsingh-portfolio.netlify.app</w:t>
+      </w:r>
+      <w:proofErr w:type="spellEnd"/>
     </w:p>
     <w:p>
       <w:pPr>
@@ -142,7 +150,18 @@
         <w:spacing w:after="40"/>
       </w:pPr>
       <w:r>
-        <w:t xml:space="preserve">Full Stack .NET Developer with internship and project experience building and deploying ASP.NET Core Web APIs, Angular applications, and SQL Server-backed systems. Reduced API response times by ~30% and developed production-style SaaS, document-intelligence, and incident-management platforms using C#, EF Core, JWT/RBAC, </w:t>
+        <w:t xml:space="preserve">Full Stack .NET Developer with </w:t>
+      </w:r>
+      <w:proofErr w:type="gramStart"/>
+      <w:r>
+        <w:t>end to end</w:t>
+      </w:r>
+      <w:proofErr w:type="gramEnd"/>
+      <w:r>
+        <w:t xml:space="preserve"> project designing and d</w:t>
+      </w:r>
+      <w:r>
+        <w:t xml:space="preserve">eploying ASP.NET Core Web APIs, Angular applications, and SQL Server-backed systems production-style SaaS, document-intelligence, and incident-management platforms using C#, EF Core, JWT/RBAC, </w:t>
       </w:r>
       <w:proofErr w:type="spellStart"/>
       <w:r>
@@ -183,40 +202,42 @@
         <w:t xml:space="preserve">Languages: </w:t>
       </w:r>
       <w:r>
-        <w:t xml:space="preserve">C#, TypeScript, JavaScript, </w:t>
+        <w:t>C#, TypeScript, JavaScript, SQL</w:t>
+      </w:r>
+      <w:r>
+        <w:t>,</w:t>
+      </w:r>
+      <w:r>
+        <w:t xml:space="preserve"> </w:t>
+      </w:r>
+      <w:r>
+        <w:t>Python</w:t>
+      </w:r>
+    </w:p>
+    <w:p>
+      <w:pPr>
+        <w:spacing w:after="30"/>
+      </w:pPr>
+      <w:r>
+        <w:rPr>
+          <w:b/>
+        </w:rPr>
+        <w:t xml:space="preserve">Frontend: </w:t>
+      </w:r>
+      <w:r>
+        <w:t>Angular, Tailwind CSS, HTML5, CSS3</w:t>
+      </w:r>
+      <w:r>
+        <w:t>,</w:t>
+      </w:r>
+      <w:r>
+        <w:t xml:space="preserve"> </w:t>
       </w:r>
       <w:proofErr w:type="spellStart"/>
-      <w:proofErr w:type="gramStart"/>
-      <w:r>
-        <w:t>SQL</w:t>
-      </w:r>
-      <w:r>
-        <w:t>,Python</w:t>
+      <w:r>
+        <w:t>DaisyUi</w:t>
       </w:r>
       <w:proofErr w:type="spellEnd"/>
-      <w:proofErr w:type="gramEnd"/>
-    </w:p>
-    <w:p>
-      <w:pPr>
-        <w:spacing w:after="30"/>
-      </w:pPr>
-      <w:r>
-        <w:rPr>
-          <w:b/>
-        </w:rPr>
-        <w:t xml:space="preserve">Frontend: </w:t>
-      </w:r>
-      <w:r>
-        <w:t xml:space="preserve">Angular, </w:t>
-      </w:r>
-      <w:proofErr w:type="spellStart"/>
-      <w:r>
-        <w:t>RxJS</w:t>
-      </w:r>
-      <w:proofErr w:type="spellEnd"/>
-      <w:r>
-        <w:t>, Tailwind CSS, HTML5, CSS3, SCSS</w:t>
-      </w:r>
     </w:p>
     <w:p>
       <w:pPr>
@@ -300,15 +321,59 @@
           <w:tab w:val="right" w:pos="10224"/>
         </w:tabs>
         <w:spacing w:before="30"/>
-      </w:pPr>
-      <w:r>
         <w:rPr>
           <w:b/>
           <w:bCs/>
           <w:sz w:val="21"/>
           <w:szCs w:val="21"/>
         </w:rPr>
-        <w:t>Software Engineer — VMR Vision, Dehradun</w:t>
+      </w:pPr>
+      <w:r>
+        <w:rPr>
+          <w:b/>
+          <w:bCs/>
+          <w:sz w:val="21"/>
+          <w:szCs w:val="21"/>
+        </w:rPr>
+        <w:t xml:space="preserve">Associate </w:t>
+      </w:r>
+      <w:proofErr w:type="spellStart"/>
+      <w:r>
+        <w:rPr>
+          <w:b/>
+          <w:bCs/>
+          <w:sz w:val="21"/>
+          <w:szCs w:val="21"/>
+        </w:rPr>
+        <w:t>Aspnet</w:t>
+      </w:r>
+      <w:proofErr w:type="spellEnd"/>
+      <w:r>
+        <w:rPr>
+          <w:b/>
+          <w:bCs/>
+          <w:sz w:val="21"/>
+          <w:szCs w:val="21"/>
+        </w:rPr>
+        <w:t xml:space="preserve"> Developer</w:t>
+      </w:r>
+      <w:r>
+        <w:rPr>
+          <w:b/>
+          <w:bCs/>
+          <w:sz w:val="21"/>
+          <w:szCs w:val="21"/>
+        </w:rPr>
+        <w:t xml:space="preserve"> </w:t>
+      </w:r>
+      <w:r>
+        <w:rPr>
+          <w:b/>
+          <w:bCs/>
+          <w:sz w:val="21"/>
+          <w:szCs w:val="21"/>
+        </w:rPr>
+        <w:t>— VMR Vision, Dehradun</w:t>
       </w:r>
       <w:r>
         <w:rPr>
@@ -317,7 +382,6 @@
           <w:color w:val="555555"/>
         </w:rPr>
         <w:tab/>
-        <w:t xml:space="preserve">Jan 2026 – </w:t>
       </w:r>
       <w:r>
         <w:rPr>
@@ -325,7 +389,47 @@
           <w:iCs/>
           <w:color w:val="555555"/>
         </w:rPr>
-        <w:t>Sep 2026</w:t>
+        <w:t>Dec</w:t>
+      </w:r>
+      <w:r>
+        <w:rPr>
+          <w:i/>
+          <w:iCs/>
+          <w:color w:val="555555"/>
+        </w:rPr>
+        <w:t xml:space="preserve"> 202</w:t>
+      </w:r>
+      <w:r>
+        <w:rPr>
+          <w:i/>
+          <w:iCs/>
+          <w:color w:val="555555"/>
+        </w:rPr>
+        <w:t>5</w:t>
+      </w:r>
+      <w:r>
+        <w:rPr>
+          <w:i/>
+          <w:iCs/>
+          <w:color w:val="555555"/>
+        </w:rPr>
+        <w:t xml:space="preserve"> – </w:t>
+      </w:r>
+      <w:r>
+        <w:rPr>
+          <w:i/>
+          <w:iCs/>
+          <w:color w:val="555555"/>
+        </w:rPr>
+        <w:t>Aug</w:t>
+      </w:r>
+      <w:r>
+        <w:rPr>
+          <w:i/>
+          <w:iCs/>
+          <w:color w:val="555555"/>
+        </w:rPr>
+        <w:t xml:space="preserve"> 2026</w:t>
       </w:r>
     </w:p>
     <w:p>
@@ -369,52 +473,6 @@
     </w:p>
     <w:p>
       <w:pPr>
-        <w:tabs>
-          <w:tab w:val="right" w:pos="10224"/>
-        </w:tabs>
-        <w:spacing w:before="30"/>
-      </w:pPr>
-      <w:r>
-        <w:rPr>
-          <w:b/>
-          <w:bCs/>
-          <w:sz w:val="21"/>
-          <w:szCs w:val="21"/>
-        </w:rPr>
-        <w:t xml:space="preserve">Backend Developer Intern — </w:t>
-      </w:r>
-      <w:proofErr w:type="spellStart"/>
-      <w:r>
-        <w:rPr>
-          <w:b/>
-          <w:bCs/>
-          <w:sz w:val="21"/>
-          <w:szCs w:val="21"/>
-        </w:rPr>
-        <w:t>Cynoteck</w:t>
-      </w:r>
-      <w:proofErr w:type="spellEnd"/>
-      <w:r>
-        <w:rPr>
-          <w:b/>
-          <w:bCs/>
-          <w:sz w:val="21"/>
-          <w:szCs w:val="21"/>
-        </w:rPr>
-        <w:t xml:space="preserve"> Technology Solutions</w:t>
-      </w:r>
-      <w:r>
-        <w:rPr>
-          <w:i/>
-          <w:iCs/>
-          <w:color w:val="555555"/>
-        </w:rPr>
-        <w:tab/>
-        <w:t>Feb 2025 – May 2025</w:t>
-      </w:r>
-    </w:p>
-    <w:p>
-      <w:pPr>
         <w:pStyle w:val="ListParagraph"/>
         <w:numPr>
           <w:ilvl w:val="0"/>
@@ -422,8 +480,82 @@
         </w:numPr>
         <w:spacing w:after="10"/>
       </w:pPr>
-      <w:r>
-        <w:t>Built and integrated RESTful ASP.NET Core Web API endpoints in C# for client-facing modules, applying OOP and clean-code practices to strengthen service reliability and frontend integration.</w:t>
+      <w:proofErr w:type="gramStart"/>
+      <w:r>
+        <w:t>Developed  and</w:t>
+      </w:r>
+      <w:proofErr w:type="gramEnd"/>
+      <w:r>
+        <w:t xml:space="preserve"> Managed Desktop Application using </w:t>
+      </w:r>
+      <w:proofErr w:type="spellStart"/>
+      <w:r>
+        <w:t>Winforms</w:t>
+      </w:r>
+      <w:proofErr w:type="spellEnd"/>
+      <w:r>
+        <w:t xml:space="preserve"> and </w:t>
+      </w:r>
+      <w:r>
+        <w:t>Windows Presentation Forms</w:t>
+      </w:r>
+      <w:r>
+        <w:t>.</w:t>
+      </w:r>
+    </w:p>
+    <w:p>
+      <w:pPr>
+        <w:tabs>
+          <w:tab w:val="right" w:pos="10224"/>
+        </w:tabs>
+        <w:spacing w:before="30"/>
+      </w:pPr>
+      <w:r>
+        <w:rPr>
+          <w:b/>
+          <w:bCs/>
+          <w:sz w:val="21"/>
+          <w:szCs w:val="21"/>
+        </w:rPr>
+        <w:t>Software</w:t>
+      </w:r>
+      <w:r>
+        <w:rPr>
+          <w:b/>
+          <w:bCs/>
+          <w:sz w:val="21"/>
+          <w:szCs w:val="21"/>
+        </w:rPr>
+        <w:t xml:space="preserve"> Developer Intern — </w:t>
+      </w:r>
+      <w:proofErr w:type="spellStart"/>
+      <w:r>
+        <w:rPr>
+          <w:b/>
+          <w:bCs/>
+          <w:sz w:val="21"/>
+          <w:szCs w:val="21"/>
+        </w:rPr>
+        <w:t>Cynoteck</w:t>
+      </w:r>
+      <w:proofErr w:type="spellEnd"/>
+      <w:r>
+        <w:rPr>
+          <w:b/>
+          <w:bCs/>
+          <w:sz w:val="21"/>
+          <w:szCs w:val="21"/>
+        </w:rPr>
+        <w:t xml:space="preserve"> Technology Solutions</w:t>
+      </w:r>
+      <w:r>
+        <w:rPr>
+          <w:i/>
+          <w:iCs/>
+          <w:color w:val="555555"/>
+        </w:rPr>
+        <w:tab/>
+        <w:t>Feb 2025 – May 2025</w:t>
       </w:r>
     </w:p>
     <w:p>
@@ -436,7 +568,7 @@
         <w:spacing w:after="10"/>
       </w:pPr>
       <w:r>
-        <w:t>Reduced API response times by ~30% on high-traffic workflows by optimizing SQL Server queries and stored procedures with ADO.NET and LINQ.</w:t>
+        <w:t>Built and integrated RESTful endpoints in for client-facing modules, applying OOP and clean-code practices to strengthen service reliability and frontend integration.</w:t>
       </w:r>
     </w:p>
     <w:p>
@@ -448,8 +580,40 @@
         </w:numPr>
         <w:spacing w:after="10"/>
       </w:pPr>
-      <w:r>
-        <w:t>Connected backend services with Angular modules and contributed through Agile sprints, code reviews, debugging, and cross-functional collaboration.</w:t>
+      <w:proofErr w:type="spellStart"/>
+      <w:r>
+        <w:t>O</w:t>
+      </w:r>
+      <w:r>
+        <w:t>ptimizi</w:t>
+      </w:r>
+      <w:r>
+        <w:t>ed</w:t>
+      </w:r>
+      <w:proofErr w:type="spellEnd"/>
+      <w:r>
+        <w:t xml:space="preserve"> </w:t>
+      </w:r>
+      <w:proofErr w:type="gramStart"/>
+      <w:r>
+        <w:t>SQL  queries</w:t>
+      </w:r>
+      <w:proofErr w:type="gramEnd"/>
+      <w:r>
+        <w:t>.</w:t>
+      </w:r>
+    </w:p>
+    <w:p>
+      <w:pPr>
+        <w:pStyle w:val="ListParagraph"/>
+        <w:numPr>
+          <w:ilvl w:val="0"/>
+          <w:numId w:val="2"/>
+        </w:numPr>
+        <w:spacing w:after="10"/>
+      </w:pPr>
+      <w:r>
+        <w:t>Connected backend services contributed through Agile sprints, code reviews, debugging, and cross-functional collaboration.</w:t>
       </w:r>
     </w:p>
     <w:p>
@@ -641,7 +805,21 @@
         <w:spacing w:after="10"/>
       </w:pPr>
       <w:r>
-        <w:t>Secured the platform with JWT, TOTP-based two-factor authentication, and RBAC; automated background workflows using Hangfire.</w:t>
+        <w:t>Secured the platform with JWT</w:t>
+      </w:r>
+      <w:r>
+        <w:t xml:space="preserve"> </w:t>
+      </w:r>
+      <w:proofErr w:type="gramStart"/>
+      <w:r>
+        <w:t>authentication,  RBAC</w:t>
+      </w:r>
+      <w:proofErr w:type="gramEnd"/>
+      <w:r>
+        <w:t xml:space="preserve"> ,</w:t>
+      </w:r>
+      <w:r>
+        <w:t xml:space="preserve"> automated background workflows using Hangfire.</w:t>
       </w:r>
     </w:p>
     <w:p>
@@ -747,7 +925,10 @@
         <w:spacing w:after="10"/>
       </w:pPr>
       <w:r>
-        <w:t>Built document upload, summarization, semantic search, and retrieval-based Q&amp;A workflows using embeddings.</w:t>
+        <w:t>Built document upload, summarization, semantic search, and retrieval-based Q&amp;A workflows</w:t>
+      </w:r>
+      <w:r>
+        <w:t>.</w:t>
       </w:r>
     </w:p>
     <w:p>
@@ -879,7 +1060,10 @@
       </w:r>
       <w:proofErr w:type="spellEnd"/>
       <w:r>
-        <w:t xml:space="preserve"> for live status updates and Hangfire for scheduled escalation jobs across the incident lifecycle.</w:t>
+        <w:t xml:space="preserve"> for live status updates and Hangfire for scheduled escalation jobs across the </w:t>
+      </w:r>
+      <w:r>
+        <w:t>incident lifecycle.</w:t>
       </w:r>
     </w:p>
     <w:p>
@@ -892,7 +1076,20 @@
         <w:spacing w:after="10"/>
       </w:pPr>
       <w:r>
-        <w:t>Resolved EF Core migration and Azure SQL firewall issues and reviewed 60+ files through static analysis to improve deployment readiness.</w:t>
+        <w:t>Implemented role-based workflows, validation, error handling, and API integration to provide a secure and maintainable application.</w:t>
+      </w:r>
+    </w:p>
+    <w:p>
+      <w:pPr>
+        <w:pStyle w:val="ListParagraph"/>
+        <w:numPr>
+          <w:ilvl w:val="0"/>
+          <w:numId w:val="2"/>
+        </w:numPr>
+        <w:spacing w:after="10"/>
+      </w:pPr>
+      <w:r>
+        <w:t>Built RESTful APIs using ASP.NET Core with structured business logic and SQL Server for reliable data management.</w:t>
       </w:r>
     </w:p>
     <w:p>
@@ -963,9 +1160,13 @@
       <w:r>
         <w:rPr>
           <w:b/>
+          <w:bCs/>
+          <w:caps/>
+          <w:color w:val="1F3864"/>
           <w:sz w:val="19"/>
-        </w:rPr>
-        <w:t>CERTIFICATION</w:t>
+          <w:szCs w:val="19"/>
+        </w:rPr>
+        <w:t>Certification</w:t>
       </w:r>
     </w:p>
     <w:p>
@@ -1648,7 +1849,6 @@
   <w:style w:type="character" w:default="1" w:styleId="DefaultParagraphFont">
     <w:name w:val="Default Paragraph Font"/>
     <w:uiPriority w:val="1"/>
-    <w:semiHidden/>
     <w:unhideWhenUsed/>
   </w:style>
   <w:style w:type="table" w:default="1" w:styleId="TableNormal">

</xml_diff>